<commit_message>
Content Browser Cleanup + Began Grenades Refactor
REMOVE: Unused assets and folders
MODIFY: Grenade logic for behavior
NOTE: Fuze - Working; Impact - WIP; Sticky - Pending
</commit_message>
<xml_diff>
--- a/Mechanics_Sandbox/ProjectDoc.docx
+++ b/Mechanics_Sandbox/ProjectDoc.docx
@@ -55,31 +55,145 @@
       </w:r>
     </w:p>
     <w:p>
-      <w:r>
-        <w:t>Rifle – Automatic</w:t>
-      </w:r>
-    </w:p>
-    <w:p>
-      <w:r>
-        <w:t>Rifle – Burst (Automatic with end)</w:t>
-      </w:r>
-    </w:p>
-    <w:p>
-      <w:r>
-        <w:t>Rifle – Semi-Auto (Burst of 1)</w:t>
-      </w:r>
-    </w:p>
-    <w:p>
-      <w:r>
-        <w:t>Rifle – Manual Action (Shot then reset)</w:t>
-      </w:r>
-    </w:p>
-    <w:p>
+      <w:pPr>
+        <w:pStyle w:val="Heading2"/>
+      </w:pPr>
+      <w:r>
+        <w:t>Rifle</w:t>
+      </w:r>
+    </w:p>
+    <w:p>
+      <w:r>
+        <w:t>Automatic</w:t>
+      </w:r>
+      <w:r>
+        <w:t xml:space="preserve"> (Check if held and</w:t>
+      </w:r>
+      <w:r>
+        <w:t xml:space="preserve"> if so</w:t>
+      </w:r>
+      <w:r>
+        <w:t>,</w:t>
+      </w:r>
+      <w:r>
+        <w:t xml:space="preserve"> </w:t>
+      </w:r>
+      <w:r>
+        <w:t>shoot</w:t>
+      </w:r>
+      <w:r>
+        <w:t>)</w:t>
+      </w:r>
+    </w:p>
+    <w:p>
+      <w:pPr>
+        <w:pStyle w:val="Heading3"/>
+      </w:pPr>
+      <w:r>
+        <w:t>Burst</w:t>
+      </w:r>
+    </w:p>
+    <w:p>
+      <w:pPr>
+        <w:pStyle w:val="ListParagraph"/>
+        <w:numPr>
+          <w:ilvl w:val="0"/>
+          <w:numId w:val="1"/>
+        </w:numPr>
+      </w:pPr>
+      <w:r>
+        <w:t>Shoot what is remaining in burst</w:t>
+      </w:r>
+    </w:p>
+    <w:p>
+      <w:pPr>
+        <w:pStyle w:val="ListParagraph"/>
+        <w:numPr>
+          <w:ilvl w:val="0"/>
+          <w:numId w:val="1"/>
+        </w:numPr>
+      </w:pPr>
+      <w:r>
+        <w:t>If ammo is depleted, reset</w:t>
+      </w:r>
+    </w:p>
+    <w:p>
+      <w:pPr>
+        <w:pStyle w:val="ListParagraph"/>
+        <w:numPr>
+          <w:ilvl w:val="0"/>
+          <w:numId w:val="1"/>
+        </w:numPr>
+      </w:pPr>
+      <w:r>
+        <w:t>When burst ends, check for if trigger held</w:t>
+      </w:r>
+      <w:r>
+        <w:t xml:space="preserve"> and</w:t>
+      </w:r>
+      <w:r>
+        <w:t xml:space="preserve"> if so</w:t>
+      </w:r>
+      <w:r>
+        <w:t>,</w:t>
+      </w:r>
+      <w:r>
+        <w:t xml:space="preserve"> shoot</w:t>
+      </w:r>
+    </w:p>
+    <w:p>
+      <w:r>
+        <w:t>Semi-Auto (Burst of 1)</w:t>
+      </w:r>
+    </w:p>
+    <w:p>
+      <w:r>
+        <w:t>M</w:t>
+      </w:r>
+      <w:r>
+        <w:t>anual Action (Sho</w:t>
+      </w:r>
+      <w:r>
+        <w:t>o</w:t>
+      </w:r>
+      <w:r>
+        <w:t>t then reset)</w:t>
+      </w:r>
+    </w:p>
+    <w:p>
+      <w:pPr>
+        <w:pStyle w:val="Heading2"/>
+      </w:pPr>
       <w:r>
         <w:t>Flamethrower</w:t>
       </w:r>
-      <w:r>
-        <w:t xml:space="preserve"> (Utilize ‘Fire’)</w:t>
+    </w:p>
+    <w:p>
+      <w:r>
+        <w:t>Utilize ‘Fire’</w:t>
+      </w:r>
+    </w:p>
+    <w:p>
+      <w:pPr>
+        <w:pStyle w:val="Heading2"/>
+      </w:pPr>
+      <w:r>
+        <w:t>Grenade</w:t>
+      </w:r>
+    </w:p>
+    <w:p>
+      <w:r>
+        <w:t>Impact (Hit -&gt; Delay -&gt; Explode)</w:t>
+      </w:r>
+    </w:p>
+    <w:p>
+      <w:r>
+        <w:t>Sticky (Like Impact, but stay with what is stuck to)</w:t>
+      </w:r>
+    </w:p>
+    <w:p>
+      <w:r>
+        <w:t>Fuze (Delay -&gt; Explode)</w:t>
       </w:r>
     </w:p>
     <w:p>
@@ -87,6 +201,7 @@
         <w:pStyle w:val="Heading1"/>
       </w:pPr>
       <w:r>
+        <w:lastRenderedPageBreak/>
         <w:t>Fire</w:t>
       </w:r>
     </w:p>
@@ -121,10 +236,7 @@
     </w:p>
     <w:p>
       <w:r>
-        <w:t>Turning</w:t>
-      </w:r>
-      <w:r>
-        <w:t xml:space="preserve"> - within set range</w:t>
+        <w:t>Turning - within set range</w:t>
       </w:r>
     </w:p>
     <w:p>
@@ -196,6 +308,126 @@
     </w:sectPr>
   </w:body>
 </w:document>
+</file>
+
+<file path=word/numbering.xml><?xml version="1.0" encoding="utf-8"?>
+<w:numbering xmlns:wpc="http://schemas.microsoft.com/office/word/2010/wordprocessingCanvas" xmlns:cx="http://schemas.microsoft.com/office/drawing/2014/chartex" xmlns:cx1="http://schemas.microsoft.com/office/drawing/2015/9/8/chartex" xmlns:cx2="http://schemas.microsoft.com/office/drawing/2015/10/21/chartex" xmlns:cx3="http://schemas.microsoft.com/office/drawing/2016/5/9/chartex" xmlns:cx4="http://schemas.microsoft.com/office/drawing/2016/5/10/chartex" xmlns:cx5="http://schemas.microsoft.com/office/drawing/2016/5/11/chartex" xmlns:cx6="http://schemas.microsoft.com/office/drawing/2016/5/12/chartex" xmlns:cx7="http://schemas.microsoft.com/office/drawing/2016/5/13/chartex" xmlns:cx8="http://schemas.microsoft.com/office/drawing/2016/5/14/chartex" xmlns:mc="http://schemas.openxmlformats.org/markup-compatibility/2006" xmlns:aink="http://schemas.microsoft.com/office/drawing/2016/ink" xmlns:am3d="http://schemas.microsoft.com/office/drawing/2017/model3d" xmlns:o="urn:schemas-microsoft-com:office:office" xmlns:oel="http://schemas.microsoft.com/office/2019/extlst" xmlns:r="http://schemas.openxmlformats.org/officeDocument/2006/relationships" xmlns:m="http://schemas.openxmlformats.org/officeDocument/2006/math" xmlns:v="urn:schemas-microsoft-com:vml" xmlns:wp14="http://schemas.microsoft.com/office/word/2010/wordprocessingDrawing" xmlns:wp="http://schemas.openxmlformats.org/drawingml/2006/wordprocessingDrawing" xmlns:w10="urn:schemas-microsoft-com:office:word" xmlns:w="http://schemas.openxmlformats.org/wordprocessingml/2006/main" xmlns:w14="http://schemas.microsoft.com/office/word/2010/wordml" xmlns:w15="http://schemas.microsoft.com/office/word/2012/wordml" xmlns:w16cex="http://schemas.microsoft.com/office/word/2018/wordml/cex" xmlns:w16cid="http://schemas.microsoft.com/office/word/2016/wordml/cid" xmlns:w16="http://schemas.microsoft.com/office/word/2018/wordml" xmlns:w16du="http://schemas.microsoft.com/office/word/2023/wordml/word16du" xmlns:w16sdtdh="http://schemas.microsoft.com/office/word/2020/wordml/sdtdatahash" xmlns:w16sdtfl="http://schemas.microsoft.com/office/word/2024/wordml/sdtformatlock" xmlns:w16se="http://schemas.microsoft.com/office/word/2015/wordml/symex" xmlns:wpg="http://schemas.microsoft.com/office/word/2010/wordprocessingGroup" xmlns:wpi="http://schemas.microsoft.com/office/word/2010/wordprocessingInk" xmlns:wne="http://schemas.microsoft.com/office/word/2006/wordml" xmlns:wps="http://schemas.microsoft.com/office/word/2010/wordprocessingShape" mc:Ignorable="w14 w15 w16se w16cid w16 w16cex w16sdtdh w16sdtfl w16du wp14">
+  <w:abstractNum w:abstractNumId="0" w15:restartNumberingAfterBreak="0">
+    <w:nsid w:val="694E1366"/>
+    <w:multiLevelType w:val="hybridMultilevel"/>
+    <w:tmpl w:val="E33AEB38"/>
+    <w:lvl w:ilvl="0" w:tplc="13D6689E">
+      <w:numFmt w:val="bullet"/>
+      <w:lvlText w:val=""/>
+      <w:lvlJc w:val="left"/>
+      <w:pPr>
+        <w:ind w:left="720" w:hanging="360"/>
+      </w:pPr>
+      <w:rPr>
+        <w:rFonts w:ascii="Symbol" w:eastAsiaTheme="minorEastAsia" w:hAnsi="Symbol" w:cstheme="minorBidi" w:hint="default"/>
+      </w:rPr>
+    </w:lvl>
+    <w:lvl w:ilvl="1" w:tplc="04090003" w:tentative="1">
+      <w:start w:val="1"/>
+      <w:numFmt w:val="bullet"/>
+      <w:lvlText w:val="o"/>
+      <w:lvlJc w:val="left"/>
+      <w:pPr>
+        <w:ind w:left="1440" w:hanging="360"/>
+      </w:pPr>
+      <w:rPr>
+        <w:rFonts w:ascii="Courier New" w:hAnsi="Courier New" w:cs="Courier New" w:hint="default"/>
+      </w:rPr>
+    </w:lvl>
+    <w:lvl w:ilvl="2" w:tplc="04090005" w:tentative="1">
+      <w:start w:val="1"/>
+      <w:numFmt w:val="bullet"/>
+      <w:lvlText w:val=""/>
+      <w:lvlJc w:val="left"/>
+      <w:pPr>
+        <w:ind w:left="2160" w:hanging="360"/>
+      </w:pPr>
+      <w:rPr>
+        <w:rFonts w:ascii="Wingdings" w:hAnsi="Wingdings" w:hint="default"/>
+      </w:rPr>
+    </w:lvl>
+    <w:lvl w:ilvl="3" w:tplc="04090001" w:tentative="1">
+      <w:start w:val="1"/>
+      <w:numFmt w:val="bullet"/>
+      <w:lvlText w:val=""/>
+      <w:lvlJc w:val="left"/>
+      <w:pPr>
+        <w:ind w:left="2880" w:hanging="360"/>
+      </w:pPr>
+      <w:rPr>
+        <w:rFonts w:ascii="Symbol" w:hAnsi="Symbol" w:hint="default"/>
+      </w:rPr>
+    </w:lvl>
+    <w:lvl w:ilvl="4" w:tplc="04090003" w:tentative="1">
+      <w:start w:val="1"/>
+      <w:numFmt w:val="bullet"/>
+      <w:lvlText w:val="o"/>
+      <w:lvlJc w:val="left"/>
+      <w:pPr>
+        <w:ind w:left="3600" w:hanging="360"/>
+      </w:pPr>
+      <w:rPr>
+        <w:rFonts w:ascii="Courier New" w:hAnsi="Courier New" w:cs="Courier New" w:hint="default"/>
+      </w:rPr>
+    </w:lvl>
+    <w:lvl w:ilvl="5" w:tplc="04090005" w:tentative="1">
+      <w:start w:val="1"/>
+      <w:numFmt w:val="bullet"/>
+      <w:lvlText w:val=""/>
+      <w:lvlJc w:val="left"/>
+      <w:pPr>
+        <w:ind w:left="4320" w:hanging="360"/>
+      </w:pPr>
+      <w:rPr>
+        <w:rFonts w:ascii="Wingdings" w:hAnsi="Wingdings" w:hint="default"/>
+      </w:rPr>
+    </w:lvl>
+    <w:lvl w:ilvl="6" w:tplc="04090001" w:tentative="1">
+      <w:start w:val="1"/>
+      <w:numFmt w:val="bullet"/>
+      <w:lvlText w:val=""/>
+      <w:lvlJc w:val="left"/>
+      <w:pPr>
+        <w:ind w:left="5040" w:hanging="360"/>
+      </w:pPr>
+      <w:rPr>
+        <w:rFonts w:ascii="Symbol" w:hAnsi="Symbol" w:hint="default"/>
+      </w:rPr>
+    </w:lvl>
+    <w:lvl w:ilvl="7" w:tplc="04090003" w:tentative="1">
+      <w:start w:val="1"/>
+      <w:numFmt w:val="bullet"/>
+      <w:lvlText w:val="o"/>
+      <w:lvlJc w:val="left"/>
+      <w:pPr>
+        <w:ind w:left="5760" w:hanging="360"/>
+      </w:pPr>
+      <w:rPr>
+        <w:rFonts w:ascii="Courier New" w:hAnsi="Courier New" w:cs="Courier New" w:hint="default"/>
+      </w:rPr>
+    </w:lvl>
+    <w:lvl w:ilvl="8" w:tplc="04090005" w:tentative="1">
+      <w:start w:val="1"/>
+      <w:numFmt w:val="bullet"/>
+      <w:lvlText w:val=""/>
+      <w:lvlJc w:val="left"/>
+      <w:pPr>
+        <w:ind w:left="6480" w:hanging="360"/>
+      </w:pPr>
+      <w:rPr>
+        <w:rFonts w:ascii="Wingdings" w:hAnsi="Wingdings" w:hint="default"/>
+      </w:rPr>
+    </w:lvl>
+  </w:abstractNum>
+  <w:num w:numId="1" w16cid:durableId="429392308">
+    <w:abstractNumId w:val="0"/>
+  </w:num>
+</w:numbering>
 </file>
 
 <file path=word/styles.xml><?xml version="1.0" encoding="utf-8"?>
@@ -648,7 +880,6 @@
     <w:next w:val="Normal"/>
     <w:link w:val="Heading3Char"/>
     <w:uiPriority w:val="9"/>
-    <w:semiHidden/>
     <w:unhideWhenUsed/>
     <w:qFormat/>
     <w:rsid w:val="001D537E"/>
@@ -855,7 +1086,6 @@
     <w:basedOn w:val="DefaultParagraphFont"/>
     <w:link w:val="Heading3"/>
     <w:uiPriority w:val="9"/>
-    <w:semiHidden/>
     <w:rsid w:val="001D537E"/>
     <w:rPr>
       <w:rFonts w:eastAsiaTheme="majorEastAsia" w:cstheme="majorBidi"/>

</xml_diff>